<commit_message>
Update RedDust Research Questionnaire - Design Document.docx
Suggestions from Sayan
</commit_message>
<xml_diff>
--- a/User Research/RedDust Research Questionnaire - Design Document.docx
+++ b/User Research/RedDust Research Questionnaire - Design Document.docx
@@ -11,23 +11,13 @@
           <w:color w:val="000000" w:themeColor="text1"/>
         </w:rPr>
       </w:pPr>
-      <w:proofErr w:type="spellStart"/>
       <w:r>
         <w:rPr>
           <w:b/>
           <w:bCs/>
           <w:color w:val="000000" w:themeColor="text1"/>
         </w:rPr>
-        <w:t>RedDust</w:t>
-      </w:r>
-      <w:proofErr w:type="spellEnd"/>
-      <w:r>
-        <w:rPr>
-          <w:b/>
-          <w:bCs/>
-          <w:color w:val="000000" w:themeColor="text1"/>
-        </w:rPr>
-        <w:t xml:space="preserve"> Research Questionnaire — Design Document</w:t>
+        <w:t>RedDust Research Questionnaire — Design Document</w:t>
       </w:r>
     </w:p>
     <w:p>
@@ -183,17 +173,8 @@
                 <w:b/>
                 <w:bCs/>
               </w:rPr>
-              <w:t xml:space="preserve">Risk if </w:t>
+              <w:t>Risk if Skipped</w:t>
             </w:r>
-            <w:proofErr w:type="gramStart"/>
-            <w:r>
-              <w:rPr>
-                <w:b/>
-                <w:bCs/>
-              </w:rPr>
-              <w:t>Skipped</w:t>
-            </w:r>
-            <w:proofErr w:type="gramEnd"/>
           </w:p>
         </w:tc>
       </w:tr>
@@ -450,15 +431,7 @@
           </w:tcPr>
           <w:p>
             <w:r>
-              <w:t xml:space="preserve">How often the underlying behaviour (mood regulation through music) </w:t>
-            </w:r>
-            <w:proofErr w:type="gramStart"/>
-            <w:r>
-              <w:t>actually occurs</w:t>
-            </w:r>
-            <w:proofErr w:type="gramEnd"/>
-            <w:r>
-              <w:t>, rather than how often users think they would use the proposed app.</w:t>
+              <w:t>How often the underlying behaviour (mood regulation through music) actually occurs, rather than how often users think they would use the proposed app.</w:t>
             </w:r>
           </w:p>
         </w:tc>
@@ -781,12 +754,22 @@
       </w:r>
     </w:p>
     <w:p>
+      <w:commentRangeStart w:id="0"/>
       <w:r>
         <w:rPr>
           <w:b/>
           <w:bCs/>
         </w:rPr>
         <w:t>Question 1</w:t>
+      </w:r>
+      <w:commentRangeEnd w:id="0"/>
+      <w:r>
+        <w:rPr>
+          <w:rStyle w:val="CommentReference"/>
+          <w:sz w:val="22"/>
+          <w:szCs w:val="22"/>
+        </w:rPr>
+        <w:commentReference w:id="0"/>
       </w:r>
       <w:r>
         <w:br/>
@@ -1092,14 +1075,27 @@
       <w:r>
         <w:t>Other</w:t>
       </w:r>
-    </w:p>
-    <w:p>
+      <w:r>
+        <w:t>:_________________________________________________________</w:t>
+      </w:r>
+    </w:p>
+    <w:p>
+      <w:commentRangeStart w:id="1"/>
       <w:r>
         <w:rPr>
           <w:b/>
           <w:bCs/>
         </w:rPr>
         <w:t>Question 6</w:t>
+      </w:r>
+      <w:commentRangeEnd w:id="1"/>
+      <w:r>
+        <w:rPr>
+          <w:rStyle w:val="CommentReference"/>
+          <w:sz w:val="22"/>
+          <w:szCs w:val="22"/>
+        </w:rPr>
+        <w:commentReference w:id="1"/>
       </w:r>
       <w:r>
         <w:br/>
@@ -1151,12 +1147,22 @@
       </w:r>
     </w:p>
     <w:p>
+      <w:commentRangeStart w:id="2"/>
       <w:r>
         <w:rPr>
           <w:b/>
           <w:bCs/>
         </w:rPr>
         <w:t>Question 7</w:t>
+      </w:r>
+      <w:commentRangeEnd w:id="2"/>
+      <w:r>
+        <w:rPr>
+          <w:rStyle w:val="CommentReference"/>
+          <w:sz w:val="22"/>
+          <w:szCs w:val="22"/>
+        </w:rPr>
+        <w:commentReference w:id="2"/>
       </w:r>
       <w:r>
         <w:br/>
@@ -1221,6 +1227,7 @@
       </w:r>
     </w:p>
     <w:p>
+      <w:commentRangeStart w:id="3"/>
       <w:r>
         <w:rPr>
           <w:b/>
@@ -1228,17 +1235,18 @@
         </w:rPr>
         <w:t>Question 8</w:t>
       </w:r>
+      <w:commentRangeEnd w:id="3"/>
+      <w:r>
+        <w:rPr>
+          <w:rStyle w:val="CommentReference"/>
+          <w:sz w:val="22"/>
+          <w:szCs w:val="22"/>
+        </w:rPr>
+        <w:commentReference w:id="3"/>
+      </w:r>
       <w:r>
         <w:br/>
-        <w:t xml:space="preserve">Walk me through, step by step, the last time you used music to change how you felt—from noticing your mood, to choosing music, to the </w:t>
-      </w:r>
-      <w:proofErr w:type="gramStart"/>
-      <w:r>
-        <w:t>final outcome</w:t>
-      </w:r>
-      <w:proofErr w:type="gramEnd"/>
-      <w:r>
-        <w:t>.</w:t>
+        <w:t>Walk me through, step by step, the last time you used music to change how you felt—from noticing your mood, to choosing music, to the final outcome.</w:t>
       </w:r>
     </w:p>
     <w:p>
@@ -2175,7 +2183,6 @@
       <w:r>
         <w:t xml:space="preserve">Imagine an app called </w:t>
       </w:r>
-      <w:proofErr w:type="spellStart"/>
       <w:r>
         <w:rPr>
           <w:b/>
@@ -2183,7 +2190,6 @@
         </w:rPr>
         <w:t>RedDust</w:t>
       </w:r>
-      <w:proofErr w:type="spellEnd"/>
       <w:r>
         <w:t xml:space="preserve"> that helps users regulate their mood through music by learning from listening behaviour, optional mood check-ins, and personalised recommendations. The following questions ask about your first impressions of this concept.</w:t>
       </w:r>
@@ -3641,15 +3647,7 @@
     </w:p>
     <w:p>
       <w:r>
-        <w:t xml:space="preserve">Would you trust recommendations more if the app explained </w:t>
-      </w:r>
-      <w:proofErr w:type="gramStart"/>
-      <w:r>
-        <w:t>why</w:t>
-      </w:r>
-      <w:proofErr w:type="gramEnd"/>
-      <w:r>
-        <w:t xml:space="preserve"> it suggested a particular song or podcast?</w:t>
+        <w:t>Would you trust recommendations more if the app explained why it suggested a particular song or podcast?</w:t>
       </w:r>
     </w:p>
     <w:p>
@@ -3717,15 +3715,7 @@
     </w:p>
     <w:p>
       <w:r>
-        <w:t xml:space="preserve">Do you believe the app could become part of your everyday routine, </w:t>
-      </w:r>
-      <w:proofErr w:type="gramStart"/>
-      <w:r>
-        <w:t>similar to</w:t>
-      </w:r>
-      <w:proofErr w:type="gramEnd"/>
-      <w:r>
-        <w:t xml:space="preserve"> Facebook, Spotify, YouTube, or ChatGPT?</w:t>
+        <w:t>Do you believe the app could become part of your everyday routine, similar to Facebook, Spotify, YouTube, or ChatGPT?</w:t>
       </w:r>
     </w:p>
     <w:p>
@@ -3890,21 +3880,12 @@
           <w:bCs/>
         </w:rPr>
       </w:pPr>
-      <w:proofErr w:type="spellStart"/>
-      <w:r>
-        <w:rPr>
-          <w:b/>
-          <w:bCs/>
-        </w:rPr>
-        <w:t>RedDust</w:t>
-      </w:r>
-      <w:proofErr w:type="spellEnd"/>
-      <w:r>
-        <w:rPr>
-          <w:b/>
-          <w:bCs/>
-        </w:rPr>
-        <w:t xml:space="preserve"> – Mood Regulation Through Music User Research Survey</w:t>
+      <w:r>
+        <w:rPr>
+          <w:b/>
+          <w:bCs/>
+        </w:rPr>
+        <w:t>RedDust – Mood Regulation Through Music User Research Survey</w:t>
       </w:r>
     </w:p>
     <w:p>
@@ -3917,15 +3898,7 @@
       </w:r>
       <w:r>
         <w:br/>
-        <w:t xml:space="preserve">This questionnaire aims to understand how people currently manage their mood and emotions, validate the </w:t>
-      </w:r>
-      <w:proofErr w:type="spellStart"/>
-      <w:r>
-        <w:t>RedDust</w:t>
-      </w:r>
-      <w:proofErr w:type="spellEnd"/>
-      <w:r>
-        <w:t xml:space="preserve"> concept, identify the most valuable features, and assess user expectations regarding privacy, trust, and pricing.</w:t>
+        <w:t>This questionnaire aims to understand how people currently manage their mood and emotions, validate the RedDust concept, identify the most valuable features, and assess user expectations regarding privacy, trust, and pricing.</w:t>
       </w:r>
     </w:p>
     <w:p>
@@ -4037,15 +4010,7 @@
       </w:r>
       <w:r>
         <w:br/>
-        <w:t xml:space="preserve">Which best describes your </w:t>
-      </w:r>
-      <w:proofErr w:type="gramStart"/>
-      <w:r>
-        <w:t>current status</w:t>
-      </w:r>
-      <w:proofErr w:type="gramEnd"/>
-      <w:r>
-        <w:t>?</w:t>
+        <w:t>Which best describes your current status?</w:t>
       </w:r>
     </w:p>
     <w:p>
@@ -4099,25 +4064,30 @@
           <w:numId w:val="33"/>
         </w:numPr>
       </w:pPr>
-      <w:proofErr w:type="gramStart"/>
       <w:r>
         <w:t>Other</w:t>
       </w:r>
       <w:r>
-        <w:t xml:space="preserve"> :</w:t>
-      </w:r>
-      <w:proofErr w:type="gramEnd"/>
-      <w:r>
-        <w:t>_____________</w:t>
-      </w:r>
-    </w:p>
-    <w:p>
+        <w:t xml:space="preserve"> :_____________</w:t>
+      </w:r>
+    </w:p>
+    <w:p>
+      <w:commentRangeStart w:id="4"/>
       <w:r>
         <w:rPr>
           <w:b/>
           <w:bCs/>
         </w:rPr>
         <w:t>Question 3</w:t>
+      </w:r>
+      <w:commentRangeEnd w:id="4"/>
+      <w:r>
+        <w:rPr>
+          <w:rStyle w:val="CommentReference"/>
+          <w:sz w:val="22"/>
+          <w:szCs w:val="22"/>
+        </w:rPr>
+        <w:commentReference w:id="4"/>
       </w:r>
       <w:r>
         <w:br/>
@@ -4300,6 +4270,7 @@
       </w:r>
     </w:p>
     <w:p>
+      <w:commentRangeStart w:id="5"/>
       <w:r>
         <w:rPr>
           <w:i/>
@@ -4310,6 +4281,15 @@
       <w:r>
         <w:t xml:space="preserve"> Rating matrix (1–5)</w:t>
       </w:r>
+      <w:commentRangeEnd w:id="5"/>
+      <w:r>
+        <w:rPr>
+          <w:rStyle w:val="CommentReference"/>
+          <w:sz w:val="22"/>
+          <w:szCs w:val="22"/>
+        </w:rPr>
+        <w:commentReference w:id="5"/>
+      </w:r>
     </w:p>
     <w:p>
       <w:pPr>
@@ -4516,25 +4496,30 @@
           <w:numId w:val="38"/>
         </w:numPr>
       </w:pPr>
-      <w:proofErr w:type="gramStart"/>
       <w:r>
         <w:t>Other</w:t>
       </w:r>
       <w:r>
-        <w:t xml:space="preserve"> :</w:t>
-      </w:r>
-      <w:proofErr w:type="gramEnd"/>
-      <w:r>
-        <w:t xml:space="preserve"> ________________</w:t>
-      </w:r>
-    </w:p>
-    <w:p>
+        <w:t xml:space="preserve"> : ________________</w:t>
+      </w:r>
+    </w:p>
+    <w:p>
+      <w:commentRangeStart w:id="6"/>
       <w:r>
         <w:rPr>
           <w:b/>
           <w:bCs/>
         </w:rPr>
         <w:t>Question 7</w:t>
+      </w:r>
+      <w:commentRangeEnd w:id="6"/>
+      <w:r>
+        <w:rPr>
+          <w:rStyle w:val="CommentReference"/>
+          <w:sz w:val="22"/>
+          <w:szCs w:val="22"/>
+        </w:rPr>
+        <w:commentReference w:id="6"/>
       </w:r>
       <w:r>
         <w:br/>
@@ -4637,13 +4622,8 @@
         <w:t>.</w:t>
       </w:r>
       <w:r>
-        <w:t xml:space="preserve"> (1 to </w:t>
-      </w:r>
-      <w:proofErr w:type="gramStart"/>
-      <w:r>
-        <w:t>5 )</w:t>
-      </w:r>
-      <w:proofErr w:type="gramEnd"/>
+        <w:t xml:space="preserve"> (1 to 5 )</w:t>
+      </w:r>
     </w:p>
     <w:p>
       <w:pPr>
@@ -4654,15 +4634,7 @@
       </w:pPr>
       <w:r>
         <w:lastRenderedPageBreak/>
-        <w:t xml:space="preserve">Generic or </w:t>
-      </w:r>
-      <w:proofErr w:type="spellStart"/>
-      <w:r>
-        <w:t>unpersonalised</w:t>
-      </w:r>
-      <w:proofErr w:type="spellEnd"/>
-      <w:r>
-        <w:t xml:space="preserve"> suggestions</w:t>
+        <w:t>Generic or unpersonalised suggestions</w:t>
       </w:r>
     </w:p>
     <w:p>
@@ -4752,7 +4724,6 @@
         </w:rPr>
         <w:t xml:space="preserve">We're exploring an app called </w:t>
       </w:r>
-      <w:proofErr w:type="spellStart"/>
       <w:r>
         <w:rPr>
           <w:b/>
@@ -4762,7 +4733,6 @@
         </w:rPr>
         <w:t>RedDust</w:t>
       </w:r>
-      <w:proofErr w:type="spellEnd"/>
       <w:r>
         <w:rPr>
           <w:i/>
@@ -4949,13 +4919,8 @@
           <w:numId w:val="42"/>
         </w:numPr>
       </w:pPr>
-      <w:proofErr w:type="gramStart"/>
-      <w:r>
-        <w:t>Other :</w:t>
-      </w:r>
-      <w:proofErr w:type="gramEnd"/>
-      <w:r>
-        <w:t xml:space="preserve"> ______________</w:t>
+      <w:r>
+        <w:t>Other : ______________</w:t>
       </w:r>
     </w:p>
     <w:p>
@@ -5022,33 +4987,15 @@
           <w:bCs/>
           <w:color w:val="EE0000"/>
         </w:rPr>
-        <w:t xml:space="preserve">Question </w:t>
-      </w:r>
-      <w:proofErr w:type="gramStart"/>
+        <w:t>Question 12</w:t>
+      </w:r>
       <w:r>
         <w:rPr>
           <w:b/>
           <w:bCs/>
           <w:color w:val="EE0000"/>
         </w:rPr>
-        <w:t>12</w:t>
-      </w:r>
-      <w:r>
-        <w:rPr>
-          <w:b/>
-          <w:bCs/>
-          <w:color w:val="EE0000"/>
-        </w:rPr>
-        <w:t xml:space="preserve">  -</w:t>
-      </w:r>
-      <w:proofErr w:type="gramEnd"/>
-      <w:r>
-        <w:rPr>
-          <w:b/>
-          <w:bCs/>
-          <w:color w:val="EE0000"/>
-        </w:rPr>
-        <w:t xml:space="preserve"> reconsider / put another question </w:t>
+        <w:t xml:space="preserve">  - reconsider / put another question </w:t>
       </w:r>
       <w:r>
         <w:rPr>
@@ -5453,11 +5400,22 @@
           <w:color w:val="EE0000"/>
         </w:rPr>
       </w:pPr>
+      <w:commentRangeStart w:id="7"/>
       <w:r>
         <w:rPr>
           <w:color w:val="EE0000"/>
         </w:rPr>
         <w:t>Fitness or health data</w:t>
+      </w:r>
+      <w:commentRangeEnd w:id="7"/>
+      <w:r>
+        <w:rPr>
+          <w:rStyle w:val="CommentReference"/>
+          <w:color w:val="EE0000"/>
+          <w:sz w:val="22"/>
+          <w:szCs w:val="22"/>
+        </w:rPr>
+        <w:commentReference w:id="7"/>
       </w:r>
     </w:p>
     <w:p>
@@ -5653,6 +5611,7 @@
           <w:color w:val="EE0000"/>
         </w:rPr>
       </w:pPr>
+      <w:commentRangeStart w:id="8"/>
       <w:r>
         <w:rPr>
           <w:b/>
@@ -5660,6 +5619,18 @@
           <w:color w:val="EE0000"/>
         </w:rPr>
         <w:t>Question 17</w:t>
+      </w:r>
+      <w:commentRangeEnd w:id="8"/>
+      <w:r>
+        <w:rPr>
+          <w:rStyle w:val="CommentReference"/>
+          <w:b/>
+          <w:bCs/>
+          <w:color w:val="EE0000"/>
+          <w:sz w:val="22"/>
+          <w:szCs w:val="22"/>
+        </w:rPr>
+        <w:commentReference w:id="8"/>
       </w:r>
       <w:r>
         <w:rPr>
@@ -5934,7 +5905,23 @@
       </w:r>
       <w:r>
         <w:br/>
-        <w:t>Is there anything about managing your mood that we haven't asked about but you think is important?</w:t>
+        <w:t xml:space="preserve">Is there anything about managing your </w:t>
+      </w:r>
+      <w:commentRangeStart w:id="9"/>
+      <w:r>
+        <w:t>mood</w:t>
+      </w:r>
+      <w:commentRangeEnd w:id="9"/>
+      <w:r>
+        <w:rPr>
+          <w:rStyle w:val="CommentReference"/>
+          <w:sz w:val="22"/>
+          <w:szCs w:val="22"/>
+        </w:rPr>
+        <w:commentReference w:id="9"/>
+      </w:r>
+      <w:r>
+        <w:t xml:space="preserve"> that we haven't asked about but you think is important?</w:t>
       </w:r>
     </w:p>
     <w:p>
@@ -6009,6 +5996,222 @@
     </w:sectPr>
   </w:body>
 </w:document>
+</file>
+
+<file path=word/comments.xml><?xml version="1.0" encoding="utf-8"?>
+<w:comments xmlns:wpc="http://schemas.microsoft.com/office/word/2010/wordprocessingCanvas" xmlns:cx="http://schemas.microsoft.com/office/drawing/2014/chartex" xmlns:cx1="http://schemas.microsoft.com/office/drawing/2015/9/8/chartex" xmlns:cx2="http://schemas.microsoft.com/office/drawing/2015/10/21/chartex" xmlns:cx3="http://schemas.microsoft.com/office/drawing/2016/5/9/chartex" xmlns:cx4="http://schemas.microsoft.com/office/drawing/2016/5/10/chartex" xmlns:cx5="http://schemas.microsoft.com/office/drawing/2016/5/11/chartex" xmlns:cx6="http://schemas.microsoft.com/office/drawing/2016/5/12/chartex" xmlns:cx7="http://schemas.microsoft.com/office/drawing/2016/5/13/chartex" xmlns:cx8="http://schemas.microsoft.com/office/drawing/2016/5/14/chartex" xmlns:mc="http://schemas.openxmlformats.org/markup-compatibility/2006" xmlns:aink="http://schemas.microsoft.com/office/drawing/2016/ink" xmlns:am3d="http://schemas.microsoft.com/office/drawing/2017/model3d" xmlns:o="urn:schemas-microsoft-com:office:office" xmlns:oel="http://schemas.microsoft.com/office/2019/extlst" xmlns:r="http://schemas.openxmlformats.org/officeDocument/2006/relationships" xmlns:m="http://schemas.openxmlformats.org/officeDocument/2006/math" xmlns:v="urn:schemas-microsoft-com:vml" xmlns:wp14="http://schemas.microsoft.com/office/word/2010/wordprocessingDrawing" xmlns:wp="http://schemas.openxmlformats.org/drawingml/2006/wordprocessingDrawing" xmlns:w10="urn:schemas-microsoft-com:office:word" xmlns:w="http://schemas.openxmlformats.org/wordprocessingml/2006/main" xmlns:w14="http://schemas.microsoft.com/office/word/2010/wordml" xmlns:w15="http://schemas.microsoft.com/office/word/2012/wordml" xmlns:w16cex="http://schemas.microsoft.com/office/word/2018/wordml/cex" xmlns:w16cid="http://schemas.microsoft.com/office/word/2016/wordml/cid" xmlns:w16="http://schemas.microsoft.com/office/word/2018/wordml" xmlns:w16du="http://schemas.microsoft.com/office/word/2023/wordml/word16du" xmlns:w16sdtdh="http://schemas.microsoft.com/office/word/2020/wordml/sdtdatahash" xmlns:w16sdtfl="http://schemas.microsoft.com/office/word/2024/wordml/sdtformatlock" xmlns:w16se="http://schemas.microsoft.com/office/word/2015/wordml/symex" xmlns:wpg="http://schemas.microsoft.com/office/word/2010/wordprocessingGroup" xmlns:wpi="http://schemas.microsoft.com/office/word/2010/wordprocessingInk" xmlns:wne="http://schemas.microsoft.com/office/word/2006/wordml" xmlns:wps="http://schemas.microsoft.com/office/word/2010/wordprocessingShape" mc:Ignorable="w14 w15 w16se w16cid w16 w16cex w16sdtdh w16sdtfl w16du wp14">
+  <w:comment w:id="0" w:author="sayanb0978@gmail.com" w:date="2026-07-09T14:13:00Z" w:initials="s">
+    <w:p>
+      <w:pPr>
+        <w:pStyle w:val="CommentText"/>
+      </w:pPr>
+      <w:r>
+        <w:rPr>
+          <w:rStyle w:val="CommentReference"/>
+        </w:rPr>
+        <w:annotationRef/>
+      </w:r>
+      <w:r>
+        <w:t>Reconsider the placement of this question. It feels on the face if we start the survey with such a deep and sensitive matter.</w:t>
+      </w:r>
+    </w:p>
+  </w:comment>
+  <w:comment w:id="1" w:author="sayanb0978@gmail.com" w:date="2026-07-09T14:18:00Z" w:initials="s">
+    <w:p>
+      <w:pPr>
+        <w:pStyle w:val="CommentText"/>
+      </w:pPr>
+      <w:r>
+        <w:rPr>
+          <w:rStyle w:val="CommentReference"/>
+        </w:rPr>
+        <w:annotationRef/>
+      </w:r>
+      <w:r>
+        <w:t>Turn this into 1-5 scale</w:t>
+      </w:r>
+    </w:p>
+  </w:comment>
+  <w:comment w:id="2" w:author="sayanb0978@gmail.com" w:date="2026-07-09T14:19:00Z" w:initials="s">
+    <w:p>
+      <w:pPr>
+        <w:pStyle w:val="CommentText"/>
+      </w:pPr>
+      <w:r>
+        <w:rPr>
+          <w:rStyle w:val="CommentReference"/>
+        </w:rPr>
+        <w:annotationRef/>
+      </w:r>
+      <w:r>
+        <w:t>Feels like a therapist session, rephrase or remove</w:t>
+      </w:r>
+    </w:p>
+  </w:comment>
+  <w:comment w:id="3" w:author="sayanb0978@gmail.com" w:date="2026-07-09T14:19:00Z" w:initials="s">
+    <w:p>
+      <w:pPr>
+        <w:pStyle w:val="CommentText"/>
+      </w:pPr>
+      <w:r>
+        <w:rPr>
+          <w:rStyle w:val="CommentReference"/>
+        </w:rPr>
+        <w:annotationRef/>
+      </w:r>
+      <w:r>
+        <w:t>Incredible hassle for the user to answer this.</w:t>
+      </w:r>
+    </w:p>
+  </w:comment>
+  <w:comment w:id="4" w:author="sayanb0978@gmail.com" w:date="2026-07-09T14:28:00Z" w:initials="s">
+    <w:p>
+      <w:pPr>
+        <w:pStyle w:val="CommentText"/>
+      </w:pPr>
+      <w:r>
+        <w:rPr>
+          <w:rStyle w:val="CommentReference"/>
+        </w:rPr>
+        <w:annotationRef/>
+      </w:r>
+      <w:r>
+        <w:t xml:space="preserve">This question </w:t>
+      </w:r>
+      <w:r>
+        <w:t>sh</w:t>
+      </w:r>
+      <w:r>
+        <w:t>ould be turned into a scale of 1-5</w:t>
+      </w:r>
+    </w:p>
+  </w:comment>
+  <w:comment w:id="5" w:author="sayanb0978@gmail.com" w:date="2026-07-09T14:29:00Z" w:initials="s">
+    <w:p>
+      <w:pPr>
+        <w:pStyle w:val="CommentText"/>
+      </w:pPr>
+      <w:r>
+        <w:rPr>
+          <w:rStyle w:val="CommentReference"/>
+        </w:rPr>
+        <w:annotationRef/>
+      </w:r>
+      <w:r>
+        <w:t>Positive emotion should be 5 so…1 = Daily/Constantly and 5 = Never / Not at all?</w:t>
+      </w:r>
+    </w:p>
+  </w:comment>
+  <w:comment w:id="6" w:author="sayanb0978@gmail.com" w:date="2026-07-09T14:36:00Z" w:initials="s">
+    <w:p>
+      <w:pPr>
+        <w:pStyle w:val="CommentText"/>
+      </w:pPr>
+      <w:r>
+        <w:rPr>
+          <w:rStyle w:val="CommentReference"/>
+        </w:rPr>
+        <w:annotationRef/>
+      </w:r>
+      <w:r>
+        <w:t>Needs 1-5 scale</w:t>
+      </w:r>
+    </w:p>
+  </w:comment>
+  <w:comment w:id="7" w:author="sayanb0978@gmail.com" w:date="2026-07-09T14:39:00Z" w:initials="s">
+    <w:p>
+      <w:pPr>
+        <w:pStyle w:val="CommentText"/>
+      </w:pPr>
+      <w:r>
+        <w:rPr>
+          <w:rStyle w:val="CommentReference"/>
+        </w:rPr>
+        <w:annotationRef/>
+      </w:r>
+      <w:r>
+        <w:t>Needs to be more specific about what data</w:t>
+      </w:r>
+    </w:p>
+  </w:comment>
+  <w:comment w:id="8" w:author="sayanb0978@gmail.com" w:date="2026-07-09T14:40:00Z" w:initials="s">
+    <w:p>
+      <w:pPr>
+        <w:pStyle w:val="CommentText"/>
+      </w:pPr>
+      <w:r>
+        <w:rPr>
+          <w:rStyle w:val="CommentReference"/>
+        </w:rPr>
+        <w:annotationRef/>
+      </w:r>
+      <w:r>
+        <w:t>Q17-Q20. Reframe in such a way so that we can get the nuance within 1 to 2 questions and in a scale of 1-5</w:t>
+      </w:r>
+    </w:p>
+  </w:comment>
+  <w:comment w:id="9" w:author="sayanb0978@gmail.com" w:date="2026-07-09T14:41:00Z" w:initials="s">
+    <w:p>
+      <w:pPr>
+        <w:pStyle w:val="CommentText"/>
+      </w:pPr>
+      <w:r>
+        <w:rPr>
+          <w:rStyle w:val="CommentReference"/>
+        </w:rPr>
+        <w:annotationRef/>
+      </w:r>
+      <w:r>
+        <w:t>Overall wellbeing of a human being</w:t>
+      </w:r>
+    </w:p>
+  </w:comment>
+</w:comments>
+</file>
+
+<file path=word/commentsExtended.xml><?xml version="1.0" encoding="utf-8"?>
+<w15:commentsEx xmlns:wpc="http://schemas.microsoft.com/office/word/2010/wordprocessingCanvas" xmlns:cx="http://schemas.microsoft.com/office/drawing/2014/chartex" xmlns:cx1="http://schemas.microsoft.com/office/drawing/2015/9/8/chartex" xmlns:cx2="http://schemas.microsoft.com/office/drawing/2015/10/21/chartex" xmlns:cx3="http://schemas.microsoft.com/office/drawing/2016/5/9/chartex" xmlns:cx4="http://schemas.microsoft.com/office/drawing/2016/5/10/chartex" xmlns:cx5="http://schemas.microsoft.com/office/drawing/2016/5/11/chartex" xmlns:cx6="http://schemas.microsoft.com/office/drawing/2016/5/12/chartex" xmlns:cx7="http://schemas.microsoft.com/office/drawing/2016/5/13/chartex" xmlns:cx8="http://schemas.microsoft.com/office/drawing/2016/5/14/chartex" xmlns:mc="http://schemas.openxmlformats.org/markup-compatibility/2006" xmlns:aink="http://schemas.microsoft.com/office/drawing/2016/ink" xmlns:am3d="http://schemas.microsoft.com/office/drawing/2017/model3d" xmlns:o="urn:schemas-microsoft-com:office:office" xmlns:oel="http://schemas.microsoft.com/office/2019/extlst" xmlns:r="http://schemas.openxmlformats.org/officeDocument/2006/relationships" xmlns:m="http://schemas.openxmlformats.org/officeDocument/2006/math" xmlns:v="urn:schemas-microsoft-com:vml" xmlns:wp14="http://schemas.microsoft.com/office/word/2010/wordprocessingDrawing" xmlns:wp="http://schemas.openxmlformats.org/drawingml/2006/wordprocessingDrawing" xmlns:w10="urn:schemas-microsoft-com:office:word" xmlns:w="http://schemas.openxmlformats.org/wordprocessingml/2006/main" xmlns:w14="http://schemas.microsoft.com/office/word/2010/wordml" xmlns:w15="http://schemas.microsoft.com/office/word/2012/wordml" xmlns:w16cex="http://schemas.microsoft.com/office/word/2018/wordml/cex" xmlns:w16cid="http://schemas.microsoft.com/office/word/2016/wordml/cid" xmlns:w16="http://schemas.microsoft.com/office/word/2018/wordml" xmlns:w16du="http://schemas.microsoft.com/office/word/2023/wordml/word16du" xmlns:w16sdtdh="http://schemas.microsoft.com/office/word/2020/wordml/sdtdatahash" xmlns:w16sdtfl="http://schemas.microsoft.com/office/word/2024/wordml/sdtformatlock" xmlns:w16se="http://schemas.microsoft.com/office/word/2015/wordml/symex" xmlns:wpg="http://schemas.microsoft.com/office/word/2010/wordprocessingGroup" xmlns:wpi="http://schemas.microsoft.com/office/word/2010/wordprocessingInk" xmlns:wne="http://schemas.microsoft.com/office/word/2006/wordml" xmlns:wps="http://schemas.microsoft.com/office/word/2010/wordprocessingShape" mc:Ignorable="w14 w15 w16se w16cid w16 w16cex w16sdtdh w16sdtfl w16du wp14">
+  <w15:commentEx w15:paraId="693D969B" w15:done="0"/>
+  <w15:commentEx w15:paraId="30EAB5CE" w15:done="0"/>
+  <w15:commentEx w15:paraId="5669E0F3" w15:done="0"/>
+  <w15:commentEx w15:paraId="0D710FB9" w15:done="0"/>
+  <w15:commentEx w15:paraId="1D0B8049" w15:done="0"/>
+  <w15:commentEx w15:paraId="3ADA8D30" w15:done="0"/>
+  <w15:commentEx w15:paraId="6F304441" w15:done="0"/>
+  <w15:commentEx w15:paraId="07F207BE" w15:done="0"/>
+  <w15:commentEx w15:paraId="1060AC85" w15:done="0"/>
+  <w15:commentEx w15:paraId="69816DC0" w15:done="0"/>
+</w15:commentsEx>
+</file>
+
+<file path=word/commentsExtensible.xml><?xml version="1.0" encoding="utf-8"?>
+<w16cex:commentsExtensible xmlns:wpc="http://schemas.microsoft.com/office/word/2010/wordprocessingCanvas" xmlns:cx="http://schemas.microsoft.com/office/drawing/2014/chartex" xmlns:cx1="http://schemas.microsoft.com/office/drawing/2015/9/8/chartex" xmlns:cx2="http://schemas.microsoft.com/office/drawing/2015/10/21/chartex" xmlns:cx3="http://schemas.microsoft.com/office/drawing/2016/5/9/chartex" xmlns:cx4="http://schemas.microsoft.com/office/drawing/2016/5/10/chartex" xmlns:cx5="http://schemas.microsoft.com/office/drawing/2016/5/11/chartex" xmlns:cx6="http://schemas.microsoft.com/office/drawing/2016/5/12/chartex" xmlns:cx7="http://schemas.microsoft.com/office/drawing/2016/5/13/chartex" xmlns:cx8="http://schemas.microsoft.com/office/drawing/2016/5/14/chartex" xmlns:cr="http://schemas.microsoft.com/office/comments/2020/reactions" xmlns:mc="http://schemas.openxmlformats.org/markup-compatibility/2006" xmlns:aink="http://schemas.microsoft.com/office/drawing/2016/ink" xmlns:am3d="http://schemas.microsoft.com/office/drawing/2017/model3d" xmlns:o="urn:schemas-microsoft-com:office:office" xmlns:oel="http://schemas.microsoft.com/office/2019/extlst" xmlns:r="http://schemas.openxmlformats.org/officeDocument/2006/relationships" xmlns:m="http://schemas.openxmlformats.org/officeDocument/2006/math" xmlns:v="urn:schemas-microsoft-com:vml" xmlns:wp14="http://schemas.microsoft.com/office/word/2010/wordprocessingDrawing" xmlns:wp="http://schemas.openxmlformats.org/drawingml/2006/wordprocessingDrawing" xmlns:w10="urn:schemas-microsoft-com:office:word" xmlns:w="http://schemas.openxmlformats.org/wordprocessingml/2006/main" xmlns:w14="http://schemas.microsoft.com/office/word/2010/wordml" xmlns:w15="http://schemas.microsoft.com/office/word/2012/wordml" xmlns:w16cex="http://schemas.microsoft.com/office/word/2018/wordml/cex" xmlns:w16cid="http://schemas.microsoft.com/office/word/2016/wordml/cid" xmlns:w16="http://schemas.microsoft.com/office/word/2018/wordml" xmlns:w16du="http://schemas.microsoft.com/office/word/2023/wordml/word16du" xmlns:w16sdtdh="http://schemas.microsoft.com/office/word/2020/wordml/sdtdatahash" xmlns:w16sdtfl="http://schemas.microsoft.com/office/word/2024/wordml/sdtformatlock" xmlns:w16se="http://schemas.microsoft.com/office/word/2015/wordml/symex" xmlns:wpg="http://schemas.microsoft.com/office/word/2010/wordprocessingGroup" xmlns:wpi="http://schemas.microsoft.com/office/word/2010/wordprocessingInk" xmlns:wne="http://schemas.microsoft.com/office/word/2006/wordml" xmlns:wps="http://schemas.microsoft.com/office/word/2010/wordprocessingShape" mc:Ignorable="w14 w15 w16se w16cid w16 w16cex w16sdtdh w16sdtfl cr w16du wp14">
+  <w16cex:commentExtensible w16cex:durableId="6680BE14" w16cex:dateUtc="2026-07-09T08:43:00Z"/>
+  <w16cex:commentExtensible w16cex:durableId="3307C249" w16cex:dateUtc="2026-07-09T08:48:00Z"/>
+  <w16cex:commentExtensible w16cex:durableId="44E4F7D6" w16cex:dateUtc="2026-07-09T08:49:00Z"/>
+  <w16cex:commentExtensible w16cex:durableId="1007AA08" w16cex:dateUtc="2026-07-09T08:49:00Z"/>
+  <w16cex:commentExtensible w16cex:durableId="569CDA45" w16cex:dateUtc="2026-07-09T08:58:00Z"/>
+  <w16cex:commentExtensible w16cex:durableId="3BA28F1B" w16cex:dateUtc="2026-07-09T08:59:00Z"/>
+  <w16cex:commentExtensible w16cex:durableId="3671F8DF" w16cex:dateUtc="2026-07-09T09:06:00Z"/>
+  <w16cex:commentExtensible w16cex:durableId="79AF108F" w16cex:dateUtc="2026-07-09T09:09:00Z"/>
+  <w16cex:commentExtensible w16cex:durableId="3E21E0BF" w16cex:dateUtc="2026-07-09T09:10:00Z"/>
+  <w16cex:commentExtensible w16cex:durableId="5457D048" w16cex:dateUtc="2026-07-09T09:11:00Z"/>
+</w16cex:commentsExtensible>
+</file>
+
+<file path=word/commentsIds.xml><?xml version="1.0" encoding="utf-8"?>
+<w16cid:commentsIds xmlns:wpc="http://schemas.microsoft.com/office/word/2010/wordprocessingCanvas" xmlns:cx="http://schemas.microsoft.com/office/drawing/2014/chartex" xmlns:cx1="http://schemas.microsoft.com/office/drawing/2015/9/8/chartex" xmlns:cx2="http://schemas.microsoft.com/office/drawing/2015/10/21/chartex" xmlns:cx3="http://schemas.microsoft.com/office/drawing/2016/5/9/chartex" xmlns:cx4="http://schemas.microsoft.com/office/drawing/2016/5/10/chartex" xmlns:cx5="http://schemas.microsoft.com/office/drawing/2016/5/11/chartex" xmlns:cx6="http://schemas.microsoft.com/office/drawing/2016/5/12/chartex" xmlns:cx7="http://schemas.microsoft.com/office/drawing/2016/5/13/chartex" xmlns:cx8="http://schemas.microsoft.com/office/drawing/2016/5/14/chartex" xmlns:mc="http://schemas.openxmlformats.org/markup-compatibility/2006" xmlns:aink="http://schemas.microsoft.com/office/drawing/2016/ink" xmlns:am3d="http://schemas.microsoft.com/office/drawing/2017/model3d" xmlns:o="urn:schemas-microsoft-com:office:office" xmlns:oel="http://schemas.microsoft.com/office/2019/extlst" xmlns:r="http://schemas.openxmlformats.org/officeDocument/2006/relationships" xmlns:m="http://schemas.openxmlformats.org/officeDocument/2006/math" xmlns:v="urn:schemas-microsoft-com:vml" xmlns:wp14="http://schemas.microsoft.com/office/word/2010/wordprocessingDrawing" xmlns:wp="http://schemas.openxmlformats.org/drawingml/2006/wordprocessingDrawing" xmlns:w10="urn:schemas-microsoft-com:office:word" xmlns:w="http://schemas.openxmlformats.org/wordprocessingml/2006/main" xmlns:w14="http://schemas.microsoft.com/office/word/2010/wordml" xmlns:w15="http://schemas.microsoft.com/office/word/2012/wordml" xmlns:w16cex="http://schemas.microsoft.com/office/word/2018/wordml/cex" xmlns:w16cid="http://schemas.microsoft.com/office/word/2016/wordml/cid" xmlns:w16="http://schemas.microsoft.com/office/word/2018/wordml" xmlns:w16du="http://schemas.microsoft.com/office/word/2023/wordml/word16du" xmlns:w16sdtdh="http://schemas.microsoft.com/office/word/2020/wordml/sdtdatahash" xmlns:w16sdtfl="http://schemas.microsoft.com/office/word/2024/wordml/sdtformatlock" xmlns:w16se="http://schemas.microsoft.com/office/word/2015/wordml/symex" xmlns:wpg="http://schemas.microsoft.com/office/word/2010/wordprocessingGroup" xmlns:wpi="http://schemas.microsoft.com/office/word/2010/wordprocessingInk" xmlns:wne="http://schemas.microsoft.com/office/word/2006/wordml" xmlns:wps="http://schemas.microsoft.com/office/word/2010/wordprocessingShape" mc:Ignorable="w14 w15 w16se w16cid w16 w16cex w16sdtdh w16sdtfl w16du wp14">
+  <w16cid:commentId w16cid:paraId="693D969B" w16cid:durableId="6680BE14"/>
+  <w16cid:commentId w16cid:paraId="30EAB5CE" w16cid:durableId="3307C249"/>
+  <w16cid:commentId w16cid:paraId="5669E0F3" w16cid:durableId="44E4F7D6"/>
+  <w16cid:commentId w16cid:paraId="0D710FB9" w16cid:durableId="1007AA08"/>
+  <w16cid:commentId w16cid:paraId="1D0B8049" w16cid:durableId="569CDA45"/>
+  <w16cid:commentId w16cid:paraId="3ADA8D30" w16cid:durableId="3BA28F1B"/>
+  <w16cid:commentId w16cid:paraId="6F304441" w16cid:durableId="3671F8DF"/>
+  <w16cid:commentId w16cid:paraId="07F207BE" w16cid:durableId="79AF108F"/>
+  <w16cid:commentId w16cid:paraId="1060AC85" w16cid:durableId="3E21E0BF"/>
+  <w16cid:commentId w16cid:paraId="69816DC0" w16cid:durableId="5457D048"/>
+</w16cid:commentsIds>
 </file>
 
 <file path=word/numbering.xml><?xml version="1.0" encoding="utf-8"?>
@@ -13767,6 +13970,14 @@
   </w:num>
   <w:numIdMacAtCleanup w:val="51"/>
 </w:numbering>
+</file>
+
+<file path=word/people.xml><?xml version="1.0" encoding="utf-8"?>
+<w15:people xmlns:wpc="http://schemas.microsoft.com/office/word/2010/wordprocessingCanvas" xmlns:cx="http://schemas.microsoft.com/office/drawing/2014/chartex" xmlns:cx1="http://schemas.microsoft.com/office/drawing/2015/9/8/chartex" xmlns:cx2="http://schemas.microsoft.com/office/drawing/2015/10/21/chartex" xmlns:cx3="http://schemas.microsoft.com/office/drawing/2016/5/9/chartex" xmlns:cx4="http://schemas.microsoft.com/office/drawing/2016/5/10/chartex" xmlns:cx5="http://schemas.microsoft.com/office/drawing/2016/5/11/chartex" xmlns:cx6="http://schemas.microsoft.com/office/drawing/2016/5/12/chartex" xmlns:cx7="http://schemas.microsoft.com/office/drawing/2016/5/13/chartex" xmlns:cx8="http://schemas.microsoft.com/office/drawing/2016/5/14/chartex" xmlns:mc="http://schemas.openxmlformats.org/markup-compatibility/2006" xmlns:aink="http://schemas.microsoft.com/office/drawing/2016/ink" xmlns:am3d="http://schemas.microsoft.com/office/drawing/2017/model3d" xmlns:o="urn:schemas-microsoft-com:office:office" xmlns:oel="http://schemas.microsoft.com/office/2019/extlst" xmlns:r="http://schemas.openxmlformats.org/officeDocument/2006/relationships" xmlns:m="http://schemas.openxmlformats.org/officeDocument/2006/math" xmlns:v="urn:schemas-microsoft-com:vml" xmlns:wp14="http://schemas.microsoft.com/office/word/2010/wordprocessingDrawing" xmlns:wp="http://schemas.openxmlformats.org/drawingml/2006/wordprocessingDrawing" xmlns:w10="urn:schemas-microsoft-com:office:word" xmlns:w="http://schemas.openxmlformats.org/wordprocessingml/2006/main" xmlns:w14="http://schemas.microsoft.com/office/word/2010/wordml" xmlns:w15="http://schemas.microsoft.com/office/word/2012/wordml" xmlns:w16cex="http://schemas.microsoft.com/office/word/2018/wordml/cex" xmlns:w16cid="http://schemas.microsoft.com/office/word/2016/wordml/cid" xmlns:w16="http://schemas.microsoft.com/office/word/2018/wordml" xmlns:w16du="http://schemas.microsoft.com/office/word/2023/wordml/word16du" xmlns:w16sdtdh="http://schemas.microsoft.com/office/word/2020/wordml/sdtdatahash" xmlns:w16sdtfl="http://schemas.microsoft.com/office/word/2024/wordml/sdtformatlock" xmlns:w16se="http://schemas.microsoft.com/office/word/2015/wordml/symex" xmlns:wpg="http://schemas.microsoft.com/office/word/2010/wordprocessingGroup" xmlns:wpi="http://schemas.microsoft.com/office/word/2010/wordprocessingInk" xmlns:wne="http://schemas.microsoft.com/office/word/2006/wordml" xmlns:wps="http://schemas.microsoft.com/office/word/2010/wordprocessingShape" mc:Ignorable="w14 w15 w16se w16cid w16 w16cex w16sdtdh w16sdtfl w16du wp14">
+  <w15:person w15:author="sayanb0978@gmail.com">
+    <w15:presenceInfo w15:providerId="Windows Live" w15:userId="2a8a4c35ac78ab32"/>
+  </w15:person>
+</w15:people>
 </file>
 
 <file path=word/styles.xml><?xml version="1.0" encoding="utf-8"?>
@@ -14372,6 +14583,7 @@
   <w:style w:type="character" w:default="1" w:styleId="DefaultParagraphFont">
     <w:name w:val="Default Paragraph Font"/>
     <w:uiPriority w:val="1"/>
+    <w:semiHidden/>
     <w:unhideWhenUsed/>
   </w:style>
   <w:style w:type="table" w:default="1" w:styleId="TableNormal">
@@ -14684,6 +14896,74 @@
       <w:spacing w:val="5"/>
     </w:rPr>
   </w:style>
+  <w:style w:type="character" w:styleId="CommentReference">
+    <w:name w:val="annotation reference"/>
+    <w:basedOn w:val="DefaultParagraphFont"/>
+    <w:uiPriority w:val="99"/>
+    <w:semiHidden/>
+    <w:unhideWhenUsed/>
+    <w:rsid w:val="00AE0EFF"/>
+    <w:rPr>
+      <w:sz w:val="16"/>
+      <w:szCs w:val="16"/>
+    </w:rPr>
+  </w:style>
+  <w:style w:type="paragraph" w:styleId="CommentText">
+    <w:name w:val="annotation text"/>
+    <w:basedOn w:val="Normal"/>
+    <w:link w:val="CommentTextChar"/>
+    <w:uiPriority w:val="99"/>
+    <w:semiHidden/>
+    <w:unhideWhenUsed/>
+    <w:rsid w:val="00AE0EFF"/>
+    <w:pPr>
+      <w:spacing w:line="240" w:lineRule="auto"/>
+    </w:pPr>
+    <w:rPr>
+      <w:sz w:val="20"/>
+      <w:szCs w:val="20"/>
+    </w:rPr>
+  </w:style>
+  <w:style w:type="character" w:customStyle="1" w:styleId="CommentTextChar">
+    <w:name w:val="Comment Text Char"/>
+    <w:basedOn w:val="DefaultParagraphFont"/>
+    <w:link w:val="CommentText"/>
+    <w:uiPriority w:val="99"/>
+    <w:semiHidden/>
+    <w:rsid w:val="00AE0EFF"/>
+    <w:rPr>
+      <w:sz w:val="20"/>
+      <w:szCs w:val="20"/>
+    </w:rPr>
+  </w:style>
+  <w:style w:type="paragraph" w:styleId="CommentSubject">
+    <w:name w:val="annotation subject"/>
+    <w:basedOn w:val="CommentText"/>
+    <w:next w:val="CommentText"/>
+    <w:link w:val="CommentSubjectChar"/>
+    <w:uiPriority w:val="99"/>
+    <w:semiHidden/>
+    <w:unhideWhenUsed/>
+    <w:rsid w:val="00AE0EFF"/>
+    <w:rPr>
+      <w:b/>
+      <w:bCs/>
+    </w:rPr>
+  </w:style>
+  <w:style w:type="character" w:customStyle="1" w:styleId="CommentSubjectChar">
+    <w:name w:val="Comment Subject Char"/>
+    <w:basedOn w:val="CommentTextChar"/>
+    <w:link w:val="CommentSubject"/>
+    <w:uiPriority w:val="99"/>
+    <w:semiHidden/>
+    <w:rsid w:val="00AE0EFF"/>
+    <w:rPr>
+      <w:b/>
+      <w:bCs/>
+      <w:sz w:val="20"/>
+      <w:szCs w:val="20"/>
+    </w:rPr>
+  </w:style>
 </w:styles>
 </file>
 

</xml_diff>